<commit_message>
finesst: replace schematic Figure 1 with a real study-area map
fig_location.png rebuilt: (A) cartopy+Natural Earth Antarctic index, (B)
grayscale hillshade of the actual Taylor Valley lidar DEM (1 m, 7x7 km)
with scale bar + north arrow. Anonymous; hillshade basemap = input terrain,
not a result. Swapped in place into v5.docx (blob + aspect + caption);
basic.md caption updated. Source DEM stays on E: (gitignored).

Co-Authored-By: Claude Fable 5 <noreply@anthropic.com>
</commit_message>
<xml_diff>
--- a/barlow/docs/finesst_proposal_v5.docx
+++ b/barlow/docs/finesst_proposal_v5.docx
@@ -59,7 +59,7 @@
         </w:rPr>
         <w:drawing>
           <wp:inline distT="0" distB="0" distL="0" distR="0">
-            <wp:extent cx="5248275" cy="2479954"/>
+            <wp:extent cx="5486400" cy="2933395"/>
             <wp:effectExtent l="0" t="0" r="0" b="0"/>
             <wp:docPr id="1" name="Picture 1"/>
             <wp:cNvGraphicFramePr>
@@ -81,7 +81,7 @@
                   <pic:spPr>
                     <a:xfrm>
                       <a:off x="0" y="0"/>
-                      <a:ext cx="5274126" cy="2492169"/>
+                      <a:ext cx="5486400" cy="2933395"/>
                     </a:xfrm>
                     <a:prstGeom prst="rect">
                       <a:avLst/>
@@ -104,7 +104,7 @@
           <w:color w:val="404040"/>
           <w:sz w:val="18"/>
         </w:rPr>
-        <w:t>Figure 1. Study-area orientation (schematic): the McMurdo Dry Valleys within Antarctica (A) and the Taylor Valley stream-lake system (B). For orientation</w:t>
+        <w:t>Figure 1. Study area. (A) The McMurdo Dry Valleys within Antarctica (coastline: Natural Earth). (B) Hillshade of the study-area lidar DEM (1 m), showing the incised valley-floor channels this project measures; 1 km scale bar, north up.</w:t>
       </w:r>
       <w:r>
         <w:rPr>
@@ -112,7 +112,6 @@
           <w:color w:val="404040"/>
           <w:sz w:val="18"/>
         </w:rPr>
-        <w:t xml:space="preserve"> only - not to scale, no data shown.</w:t>
       </w:r>
     </w:p>
     <w:p>

</xml_diff>

<commit_message>
finesst: recolor Figure 1 hillshade (viridis blend) for legibility
Co-Authored-By: Claude Fable 5 <noreply@anthropic.com>
</commit_message>
<xml_diff>
--- a/barlow/docs/finesst_proposal_v5.docx
+++ b/barlow/docs/finesst_proposal_v5.docx
@@ -18,8 +18,6 @@
       </w:r>
     </w:p>
     <w:p>
-      <w:bookmarkStart w:id="0" w:name="_GoBack"/>
-      <w:bookmarkEnd w:id="0"/>
       <w:r>
         <w:t>Summary: A tool from Barlow (2026) can find where Antarctic Dry Valley streams are reshaping the land, but it stops at location. It says where, never why. This project starts at that line. I'll connect the measured change to the processes driving it (heat, melt, thawing ground), widen the measurement from the stream channels to the whole valley floor, and attach a real uncertainty value to every pixel.</w:t>
       </w:r>
@@ -47,7 +45,6 @@
       <w:r>
         <w:t>The McMurdo Dry Valleys (MDVs) are the largest ice-free region of Antarctica. For most of a century they were treated as one of Earth's most stable landscapes, lacking strong erosive forces. That view is now an open question. The valleys are energy-limited: ice is everywhere, but there is barely enough summer heat to melt much of it. A small warming produces a measurable response — ephemeral streams (channels that flow only during a brief melt season) carry more water, move sediment, and reshape the terrain.</w:t>
       </w:r>
-      <w:r/>
     </w:p>
     <w:p>
       <w:pPr>
@@ -106,13 +103,6 @@
         </w:rPr>
         <w:t>Figure 1. Study area. (A) The McMurdo Dry Valleys within Antarctica (coastline: Natural Earth). (B) Hillshade of the study-area lidar DEM (1 m), showing the incised valley-floor channels this project measures; 1 km scale bar, north up.</w:t>
       </w:r>
-      <w:r>
-        <w:rPr>
-          <w:i/>
-          <w:color w:val="404040"/>
-          <w:sz w:val="18"/>
-        </w:rPr>
-      </w:r>
     </w:p>
     <w:p>
       <w:pPr>
@@ -180,6 +170,7 @@
         </w:rPr>
       </w:pPr>
       <w:r>
+        <w:lastRenderedPageBreak/>
         <w:t>Maps of elevation change (erosion and deposition) across four valleys and three survey periods (2001, 2014, 2021-23).</w:t>
       </w:r>
     </w:p>
@@ -306,23 +297,23 @@
           <w:b/>
           <w:sz w:val="32"/>
         </w:rPr>
+        <w:t>Approach</w:t>
+      </w:r>
+    </w:p>
+    <w:p>
+      <w:r>
+        <w:t>By objective:</w:t>
+      </w:r>
+    </w:p>
+    <w:p>
+      <w:pPr>
+        <w:jc w:val="center"/>
+      </w:pPr>
+      <w:r>
+        <w:rPr>
+          <w:noProof/>
+        </w:rPr>
         <w:lastRenderedPageBreak/>
-        <w:t>Approach</w:t>
-      </w:r>
-    </w:p>
-    <w:p>
-      <w:r>
-        <w:t>By objective:</w:t>
-      </w:r>
-    </w:p>
-    <w:p>
-      <w:pPr>
-        <w:jc w:val="center"/>
-      </w:pPr>
-      <w:r>
-        <w:rPr>
-          <w:noProof/>
-        </w:rPr>
         <w:drawing>
           <wp:inline distT="0" distB="0" distL="0" distR="0">
             <wp:extent cx="5486400" cy="3830432"/>
@@ -370,15 +361,7 @@
           <w:color w:val="404040"/>
           <w:sz w:val="18"/>
         </w:rPr>
-        <w:t xml:space="preserve">Figure 2. Planned detection-to-attribution workflow: three DEM epochs, co-registration, DEM-of-Difference, per-pixel detection </w:t>
-      </w:r>
-      <w:r>
-        <w:rPr>
-          <w:i/>
-          <w:color w:val="404040"/>
-          <w:sz w:val="18"/>
-        </w:rPr>
-        <w:t>floor, then the O1 (channel), O2 (valley-floor), and O3 (uncertainty) objectives. Method schematic; no results shown.</w:t>
+        <w:t>Figure 2. Planned detection-to-attribution workflow: three DEM epochs, co-registration, DEM-of-Difference, per-pixel detection floor, then the O1 (channel), O2 (valley-floor), and O3 (uncertainty) objectives. Method schematic; no results shown.</w:t>
       </w:r>
     </w:p>
     <w:p>
@@ -468,6 +451,7 @@
         </w:numPr>
       </w:pPr>
       <w:r>
+        <w:lastRenderedPageBreak/>
         <w:t>Describe each patch by area, mean elevation change, local slope and aspect, and distance to the nearest channel and lake, then classify it by process type from that signature. I start with rules and fall back to a learned classifier only if they underperform.</w:t>
       </w:r>
     </w:p>
@@ -1145,10 +1129,9 @@
     </w:p>
     <w:p>
       <w:r>
+        <w:lastRenderedPageBreak/>
         <w:t>A single workstation GPU trains the segmentation models; the elevation processing is CPU-bound and modest. No supercomputer allocation is required. Full-valley raster stacks reach tens of gigabytes and need only local storage, not specialized infrastructure.</w:t>
       </w:r>
-      <w:r/>
-      <w:r/>
     </w:p>
     <w:p>
       <w:r>
@@ -1163,7 +1146,6 @@
       <w:r>
         <w:t>The researcher has built terrain-segmentation and change-detection pipelines on non-Antarctic data but is new to Antarctic hydrology and hierarchical statistical modeling. Coursework and mentorship are detailed elsewhere.</w:t>
       </w:r>
-      <w:r/>
     </w:p>
     <w:p>
       <w:r>
@@ -1253,20 +1235,21 @@
       <w:r>
         <w:t>Outside the channels, change may be too small to detect. The valley floors change slowly, so much of the surface may sit below our detection threshold. If so, objective 2 narrows back to in-channel change and the landscape-wide result is reported accordingly.</w:t>
       </w:r>
-      <w:r/>
-      <w:r/>
     </w:p>
     <w:p>
       <w:r>
         <w:t>Even so, the proposal is worth doing. The MDV streams are the most direct, measurable climate response in one of Earth's most stable landscapes, and the data — two LiDAR epochs, a satellite record, and LTER station records — already exist and are free.</w:t>
       </w:r>
     </w:p>
+    <w:p/>
+    <w:p/>
     <w:p>
       <w:r>
         <w:rPr>
           <w:b/>
           <w:sz w:val="24"/>
         </w:rPr>
+        <w:lastRenderedPageBreak/>
         <w:t>Timeline</w:t>
       </w:r>
     </w:p>
@@ -1864,7 +1847,6 @@
         <w:rPr>
           <w:rFonts w:ascii="Calibri" w:hAnsi="Calibri"/>
         </w:rPr>
-        <w:lastRenderedPageBreak/>
         <w:t xml:space="preserve">[7] </w:t>
       </w:r>
       <w:proofErr w:type="spellStart"/>
@@ -1910,14 +1892,9 @@
         </w:rPr>
         <w:t xml:space="preserve"> 146:1999–2049.</w:t>
       </w:r>
-    </w:p>
-    <w:p>
-      <w:pPr>
-        <w:spacing w:after="120"/>
-      </w:pPr>
-    </w:p>
-    <w:p/>
-    <w:p/>
+      <w:bookmarkStart w:id="0" w:name="_GoBack"/>
+      <w:bookmarkEnd w:id="0"/>
+    </w:p>
     <w:p>
       <w:r>
         <w:t xml:space="preserve">Claude Fable was used for </w:t>
@@ -1925,15 +1902,6 @@
       <w:r>
         <w:t>proofreading.</w:t>
       </w:r>
-    </w:p>
-    <w:p/>
-    <w:p/>
-    <w:p/>
-    <w:p/>
-    <w:p>
-      <w:pPr>
-        <w:ind w:left="360"/>
-      </w:pPr>
     </w:p>
     <w:sectPr>
       <w:pgSz w:w="12240" w:h="15840"/>

</xml_diff>

<commit_message>
finesst: zoom Figure 1 Panel B to the channel corridors
Co-Authored-By: Claude Fable 5 <noreply@anthropic.com>
</commit_message>
<xml_diff>
--- a/barlow/docs/finesst_proposal_v5.docx
+++ b/barlow/docs/finesst_proposal_v5.docx
@@ -56,7 +56,7 @@
         </w:rPr>
         <w:drawing>
           <wp:inline distT="0" distB="0" distL="0" distR="0">
-            <wp:extent cx="5486400" cy="2933395"/>
+            <wp:extent cx="5486400" cy="2706624"/>
             <wp:effectExtent l="0" t="0" r="0" b="0"/>
             <wp:docPr id="1" name="Picture 1"/>
             <wp:cNvGraphicFramePr>
@@ -78,7 +78,7 @@
                   <pic:spPr>
                     <a:xfrm>
                       <a:off x="0" y="0"/>
-                      <a:ext cx="5486400" cy="2933395"/>
+                      <a:ext cx="5486400" cy="2706624"/>
                     </a:xfrm>
                     <a:prstGeom prst="rect">
                       <a:avLst/>

</xml_diff>